<commit_message>
Update Document - Projeto de Extensão
Preenchimento de campos em brancos que faltaram.
</commit_message>
<xml_diff>
--- a/documentos/Documento - Projeto de Extensão - COM Empresa.docx
+++ b/documentos/Documento - Projeto de Extensão - COM Empresa.docx
@@ -94,7 +94,7 @@
           <w:sz w:val="20"/>
           <w:szCs w:val="20"/>
         </w:rPr>
-        <w:t>Título do Projeto</w:t>
+        <w:t>Los Meninos do Back</w:t>
       </w:r>
     </w:p>
     <w:p>
@@ -138,26 +138,18 @@
                 <w:color w:val="525252" w:themeColor="accent3" w:themeShade="80"/>
                 <w:sz w:val="20"/>
                 <w:szCs w:val="20"/>
-              </w:rPr>
-            </w:pPr>
-            <w:r>
-              <w:rPr>
-                <w:rFonts w:ascii="Arial" w:eastAsia="Arial" w:hAnsi="Arial" w:cs="Arial"/>
-                <w:color w:val="525252" w:themeColor="accent3" w:themeShade="80"/>
-                <w:sz w:val="20"/>
-                <w:szCs w:val="20"/>
-              </w:rPr>
-              <w:t>Inserir os dados neste espaço. Orientações: descrição sucinta englobando o tema do projeto.</w:t>
-            </w:r>
-          </w:p>
-          <w:p>
-            <w:pPr>
-              <w:rPr>
-                <w:rFonts w:ascii="Arial" w:eastAsia="Arial" w:hAnsi="Arial" w:cs="Arial"/>
-                <w:sz w:val="20"/>
-                <w:szCs w:val="20"/>
-              </w:rPr>
-            </w:pPr>
+                <w:u w:val="single"/>
+              </w:rPr>
+            </w:pPr>
+            <w:r>
+              <w:rPr>
+                <w:rFonts w:ascii="Arial" w:eastAsia="Arial" w:hAnsi="Arial" w:cs="Arial"/>
+                <w:b/>
+                <w:sz w:val="20"/>
+                <w:szCs w:val="20"/>
+              </w:rPr>
+              <w:t>Desenvolvimento de uma aplicação web responsiva e um aplicativo mobile para gerenciamento de atividades realizadas por pacientes e para mentoria nos exercícios propostos pela fisioterapeuta.</w:t>
+            </w:r>
           </w:p>
         </w:tc>
       </w:tr>
@@ -456,20 +448,8 @@
                 <w:sz w:val="20"/>
                 <w:szCs w:val="20"/>
               </w:rPr>
-              <w:t xml:space="preserve">Gustavo Lucas </w:t>
-            </w:r>
-            <w:proofErr w:type="spellStart"/>
-            <w:r>
-              <w:rPr>
-                <w:rFonts w:ascii="Arial" w:eastAsia="Arial" w:hAnsi="Arial" w:cs="Arial"/>
-                <w:b/>
-                <w:bCs/>
-                <w:sz w:val="20"/>
-                <w:szCs w:val="20"/>
-              </w:rPr>
-              <w:t>Archangelo</w:t>
-            </w:r>
-            <w:proofErr w:type="spellEnd"/>
+              <w:t>Gustavo Lucas Archangelo</w:t>
+            </w:r>
           </w:p>
           <w:p>
             <w:pPr>
@@ -680,21 +660,8 @@
                 <w:sz w:val="20"/>
                 <w:szCs w:val="20"/>
               </w:rPr>
-              <w:t xml:space="preserve">Victor Bruno Alexander Rosetti de </w:t>
-            </w:r>
-            <w:proofErr w:type="spellStart"/>
-            <w:r>
-              <w:rPr>
-                <w:rFonts w:ascii="Arial" w:eastAsia="Arial" w:hAnsi="Arial" w:cs="Arial"/>
-                <w:b/>
-                <w:bCs/>
-                <w:color w:val="000000"/>
-                <w:sz w:val="20"/>
-                <w:szCs w:val="20"/>
-              </w:rPr>
-              <w:t>Quiroz</w:t>
-            </w:r>
-            <w:proofErr w:type="spellEnd"/>
+              <w:t>Victor Bruno Alexander Rosetti de Quiroz</w:t>
+            </w:r>
           </w:p>
         </w:tc>
       </w:tr>
@@ -1392,31 +1359,7 @@
                 <w:sz w:val="20"/>
                 <w:szCs w:val="20"/>
               </w:rPr>
-              <w:t xml:space="preserve">O local de implementação será tanto no próprio site da </w:t>
-            </w:r>
-            <w:proofErr w:type="spellStart"/>
-            <w:r>
-              <w:rPr>
-                <w:rFonts w:ascii="Arial" w:eastAsia="Arial" w:hAnsi="Arial" w:cs="Arial"/>
-                <w:b/>
-                <w:bCs/>
-                <w:color w:val="000000" w:themeColor="text1"/>
-                <w:sz w:val="20"/>
-                <w:szCs w:val="20"/>
-              </w:rPr>
-              <w:t>clinica</w:t>
-            </w:r>
-            <w:proofErr w:type="spellEnd"/>
-            <w:r>
-              <w:rPr>
-                <w:rFonts w:ascii="Arial" w:eastAsia="Arial" w:hAnsi="Arial" w:cs="Arial"/>
-                <w:b/>
-                <w:bCs/>
-                <w:color w:val="000000" w:themeColor="text1"/>
-                <w:sz w:val="20"/>
-                <w:szCs w:val="20"/>
-              </w:rPr>
-              <w:t>, como também será criada uma aplicação mobile para que torne mais acessível o acesso aos exercícios.</w:t>
+              <w:t>O local de implementação será tanto no próprio site da clinica, como também será criada uma aplicação mobile para que torne mais acessível o acesso aos exercícios.</w:t>
             </w:r>
           </w:p>
         </w:tc>
@@ -1495,31 +1438,7 @@
                 <w:sz w:val="20"/>
                 <w:szCs w:val="20"/>
               </w:rPr>
-              <w:t xml:space="preserve">O </w:t>
-            </w:r>
-            <w:proofErr w:type="spellStart"/>
-            <w:r>
-              <w:rPr>
-                <w:rFonts w:ascii="Arial" w:eastAsia="Arial" w:hAnsi="Arial" w:cs="Arial"/>
-                <w:b/>
-                <w:bCs/>
-                <w:color w:val="000000" w:themeColor="text1"/>
-                <w:sz w:val="20"/>
-                <w:szCs w:val="20"/>
-              </w:rPr>
-              <w:t>publico</w:t>
-            </w:r>
-            <w:proofErr w:type="spellEnd"/>
-            <w:r>
-              <w:rPr>
-                <w:rFonts w:ascii="Arial" w:eastAsia="Arial" w:hAnsi="Arial" w:cs="Arial"/>
-                <w:b/>
-                <w:bCs/>
-                <w:color w:val="000000" w:themeColor="text1"/>
-                <w:sz w:val="20"/>
-                <w:szCs w:val="20"/>
-              </w:rPr>
-              <w:t xml:space="preserve"> alvo do projeto são os pacientes que frequentam a clinica da </w:t>
+              <w:t xml:space="preserve">O publico alvo do projeto são os pacientes que frequentam a clinica da </w:t>
             </w:r>
             <w:r>
               <w:rPr>
@@ -1628,55 +1547,7 @@
                 <w:sz w:val="20"/>
                 <w:szCs w:val="20"/>
               </w:rPr>
-              <w:t xml:space="preserve">A empresa Maya Yamamoto RPG é uma </w:t>
-            </w:r>
-            <w:proofErr w:type="spellStart"/>
-            <w:r>
-              <w:rPr>
-                <w:rFonts w:ascii="Arial" w:eastAsia="Arial" w:hAnsi="Arial" w:cs="Arial"/>
-                <w:b/>
-                <w:bCs/>
-                <w:color w:val="000000" w:themeColor="text1"/>
-                <w:sz w:val="20"/>
-                <w:szCs w:val="20"/>
-              </w:rPr>
-              <w:t>clinica</w:t>
-            </w:r>
-            <w:proofErr w:type="spellEnd"/>
-            <w:r>
-              <w:rPr>
-                <w:rFonts w:ascii="Arial" w:eastAsia="Arial" w:hAnsi="Arial" w:cs="Arial"/>
-                <w:b/>
-                <w:bCs/>
-                <w:color w:val="000000" w:themeColor="text1"/>
-                <w:sz w:val="20"/>
-                <w:szCs w:val="20"/>
-              </w:rPr>
-              <w:t xml:space="preserve"> de fisioterapia que </w:t>
-            </w:r>
-            <w:proofErr w:type="gramStart"/>
-            <w:r>
-              <w:rPr>
-                <w:rFonts w:ascii="Arial" w:eastAsia="Arial" w:hAnsi="Arial" w:cs="Arial"/>
-                <w:b/>
-                <w:bCs/>
-                <w:color w:val="000000" w:themeColor="text1"/>
-                <w:sz w:val="20"/>
-                <w:szCs w:val="20"/>
-              </w:rPr>
-              <w:t>esta</w:t>
-            </w:r>
-            <w:proofErr w:type="gramEnd"/>
-            <w:r>
-              <w:rPr>
-                <w:rFonts w:ascii="Arial" w:eastAsia="Arial" w:hAnsi="Arial" w:cs="Arial"/>
-                <w:b/>
-                <w:bCs/>
-                <w:color w:val="000000" w:themeColor="text1"/>
-                <w:sz w:val="20"/>
-                <w:szCs w:val="20"/>
-              </w:rPr>
-              <w:t xml:space="preserve"> buscando uma solução para facilitar no processo de recuperação dos pacientes através de algo que seja intuitivo e que possa ser acessada de qualquer lugar.</w:t>
+              <w:t>A empresa Maya Yamamoto RPG é uma clinica de fisioterapia que esta buscando uma solução para facilitar no processo de recuperação dos pacientes através de algo que seja intuitivo e que possa ser acessada de qualquer lugar.</w:t>
             </w:r>
           </w:p>
           <w:p>
@@ -1784,31 +1655,7 @@
                 <w:sz w:val="20"/>
                 <w:szCs w:val="20"/>
               </w:rPr>
-              <w:t xml:space="preserve">A partir do que foi observado por nós, chegamos </w:t>
-            </w:r>
-            <w:proofErr w:type="gramStart"/>
-            <w:r>
-              <w:rPr>
-                <w:rFonts w:ascii="Arial" w:eastAsia="Arial" w:hAnsi="Arial" w:cs="Arial"/>
-                <w:b/>
-                <w:bCs/>
-                <w:color w:val="000000" w:themeColor="text1"/>
-                <w:sz w:val="20"/>
-                <w:szCs w:val="20"/>
-              </w:rPr>
-              <w:t>a</w:t>
-            </w:r>
-            <w:proofErr w:type="gramEnd"/>
-            <w:r>
-              <w:rPr>
-                <w:rFonts w:ascii="Arial" w:eastAsia="Arial" w:hAnsi="Arial" w:cs="Arial"/>
-                <w:b/>
-                <w:bCs/>
-                <w:color w:val="000000" w:themeColor="text1"/>
-                <w:sz w:val="20"/>
-                <w:szCs w:val="20"/>
-              </w:rPr>
-              <w:t xml:space="preserve"> conclusão que uma aplicação web e um aplicativo mobile podem ser úteis para ajudar no gerenciamento e administração dos pacientes, como também na parte de recuperação dos mesmos. </w:t>
+              <w:t xml:space="preserve">A partir do que foi observado por nós, chegamos a conclusão que uma aplicação web e um aplicativo mobile podem ser úteis para ajudar no gerenciamento e administração dos pacientes, como também na parte de recuperação dos mesmos. </w:t>
             </w:r>
           </w:p>
         </w:tc>
@@ -2969,108 +2816,16 @@
                 <w:sz w:val="20"/>
                 <w:szCs w:val="20"/>
               </w:rPr>
-              <w:t xml:space="preserve">Global </w:t>
-            </w:r>
-            <w:proofErr w:type="spellStart"/>
-            <w:r>
-              <w:rPr>
-                <w:rFonts w:ascii="Arial" w:eastAsia="Arial" w:hAnsi="Arial" w:cs="Arial"/>
-                <w:b/>
-                <w:bCs/>
+              <w:t>Global strategy on digital health 2020-2025</w:t>
+            </w:r>
+            <w:r>
+              <w:rPr>
+                <w:rFonts w:ascii="Arial" w:eastAsia="Arial" w:hAnsi="Arial" w:cs="Arial"/>
                 <w:color w:val="525252" w:themeColor="accent3" w:themeShade="80"/>
                 <w:sz w:val="20"/>
                 <w:szCs w:val="20"/>
               </w:rPr>
-              <w:t>strategy</w:t>
-            </w:r>
-            <w:proofErr w:type="spellEnd"/>
-            <w:r>
-              <w:rPr>
-                <w:rFonts w:ascii="Arial" w:eastAsia="Arial" w:hAnsi="Arial" w:cs="Arial"/>
-                <w:b/>
-                <w:bCs/>
-                <w:color w:val="525252" w:themeColor="accent3" w:themeShade="80"/>
-                <w:sz w:val="20"/>
-                <w:szCs w:val="20"/>
-              </w:rPr>
-              <w:t xml:space="preserve"> </w:t>
-            </w:r>
-            <w:proofErr w:type="spellStart"/>
-            <w:r>
-              <w:rPr>
-                <w:rFonts w:ascii="Arial" w:eastAsia="Arial" w:hAnsi="Arial" w:cs="Arial"/>
-                <w:b/>
-                <w:bCs/>
-                <w:color w:val="525252" w:themeColor="accent3" w:themeShade="80"/>
-                <w:sz w:val="20"/>
-                <w:szCs w:val="20"/>
-              </w:rPr>
-              <w:t>on</w:t>
-            </w:r>
-            <w:proofErr w:type="spellEnd"/>
-            <w:r>
-              <w:rPr>
-                <w:rFonts w:ascii="Arial" w:eastAsia="Arial" w:hAnsi="Arial" w:cs="Arial"/>
-                <w:b/>
-                <w:bCs/>
-                <w:color w:val="525252" w:themeColor="accent3" w:themeShade="80"/>
-                <w:sz w:val="20"/>
-                <w:szCs w:val="20"/>
-              </w:rPr>
-              <w:t xml:space="preserve"> digital </w:t>
-            </w:r>
-            <w:proofErr w:type="spellStart"/>
-            <w:r>
-              <w:rPr>
-                <w:rFonts w:ascii="Arial" w:eastAsia="Arial" w:hAnsi="Arial" w:cs="Arial"/>
-                <w:b/>
-                <w:bCs/>
-                <w:color w:val="525252" w:themeColor="accent3" w:themeShade="80"/>
-                <w:sz w:val="20"/>
-                <w:szCs w:val="20"/>
-              </w:rPr>
-              <w:t>health</w:t>
-            </w:r>
-            <w:proofErr w:type="spellEnd"/>
-            <w:r>
-              <w:rPr>
-                <w:rFonts w:ascii="Arial" w:eastAsia="Arial" w:hAnsi="Arial" w:cs="Arial"/>
-                <w:b/>
-                <w:bCs/>
-                <w:color w:val="525252" w:themeColor="accent3" w:themeShade="80"/>
-                <w:sz w:val="20"/>
-                <w:szCs w:val="20"/>
-              </w:rPr>
-              <w:t xml:space="preserve"> 2020-2025</w:t>
-            </w:r>
-            <w:r>
-              <w:rPr>
-                <w:rFonts w:ascii="Arial" w:eastAsia="Arial" w:hAnsi="Arial" w:cs="Arial"/>
-                <w:color w:val="525252" w:themeColor="accent3" w:themeShade="80"/>
-                <w:sz w:val="20"/>
-                <w:szCs w:val="20"/>
-              </w:rPr>
-              <w:t xml:space="preserve">. Geneva: World Health </w:t>
-            </w:r>
-            <w:proofErr w:type="spellStart"/>
-            <w:r>
-              <w:rPr>
-                <w:rFonts w:ascii="Arial" w:eastAsia="Arial" w:hAnsi="Arial" w:cs="Arial"/>
-                <w:color w:val="525252" w:themeColor="accent3" w:themeShade="80"/>
-                <w:sz w:val="20"/>
-                <w:szCs w:val="20"/>
-              </w:rPr>
-              <w:t>Organization</w:t>
-            </w:r>
-            <w:proofErr w:type="spellEnd"/>
-            <w:r>
-              <w:rPr>
-                <w:rFonts w:ascii="Arial" w:eastAsia="Arial" w:hAnsi="Arial" w:cs="Arial"/>
-                <w:color w:val="525252" w:themeColor="accent3" w:themeShade="80"/>
-                <w:sz w:val="20"/>
-                <w:szCs w:val="20"/>
-              </w:rPr>
-              <w:t>, 2021.</w:t>
+              <w:t>. Geneva: World Health Organization, 2021.</w:t>
             </w:r>
           </w:p>
           <w:p>
@@ -4324,6 +4079,7 @@
   <w:style w:type="character" w:default="1" w:styleId="Fontepargpadro">
     <w:name w:val="Default Paragraph Font"/>
     <w:uiPriority w:val="1"/>
+    <w:semiHidden/>
     <w:unhideWhenUsed/>
   </w:style>
   <w:style w:type="table" w:default="1" w:styleId="Tabelanormal">
@@ -4713,6 +4469,26 @@
 </file>
 
 <file path=customXml/item1.xml><?xml version="1.0" encoding="utf-8"?>
+<p:properties xmlns:p="http://schemas.microsoft.com/office/2006/metadata/properties" xmlns:xsi="http://www.w3.org/2001/XMLSchema-instance" xmlns:pc="http://schemas.microsoft.com/office/infopath/2007/PartnerControls">
+  <documentManagement>
+    <lcf76f155ced4ddcb4097134ff3c332f xmlns="8ca2a57e-8138-4b57-956a-eb6e2c7049cc">
+      <Terms xmlns="http://schemas.microsoft.com/office/infopath/2007/PartnerControls"/>
+    </lcf76f155ced4ddcb4097134ff3c332f>
+    <TaxCatchAll xmlns="1d2798d9-1030-4cc5-be7b-200f9e628651" xsi:nil="true"/>
+  </documentManagement>
+</p:properties>
+</file>
+
+<file path=customXml/item2.xml><?xml version="1.0" encoding="utf-8"?>
+<?mso-contentType ?>
+<FormTemplates xmlns="http://schemas.microsoft.com/sharepoint/v3/contenttype/forms">
+  <Display>DocumentLibraryForm</Display>
+  <Edit>DocumentLibraryForm</Edit>
+  <New>DocumentLibraryForm</New>
+</FormTemplates>
+</file>
+
+<file path=customXml/item3.xml><?xml version="1.0" encoding="utf-8"?>
 <ct:contentTypeSchema xmlns:ct="http://schemas.microsoft.com/office/2006/metadata/contentType" xmlns:ma="http://schemas.microsoft.com/office/2006/metadata/properties/metaAttributes" ct:_="" ma:_="" ma:contentTypeName="Documento" ma:contentTypeID="0x01010045364877AF745B4281652B53F43C594A" ma:contentTypeVersion="15" ma:contentTypeDescription="Crie um novo documento." ma:contentTypeScope="" ma:versionID="440a6fbbcbce65e3f8e2bed610644788">
   <xsd:schema xmlns:xsd="http://www.w3.org/2001/XMLSchema" xmlns:xs="http://www.w3.org/2001/XMLSchema" xmlns:p="http://schemas.microsoft.com/office/2006/metadata/properties" xmlns:ns2="1d2798d9-1030-4cc5-be7b-200f9e628651" xmlns:ns3="8ca2a57e-8138-4b57-956a-eb6e2c7049cc" targetNamespace="http://schemas.microsoft.com/office/2006/metadata/properties" ma:root="true" ma:fieldsID="3ff20d9b6411658b7762fa2c08d7e1af" ns2:_="" ns3:_="">
     <xsd:import namespace="1d2798d9-1030-4cc5-be7b-200f9e628651"/>
@@ -4947,27 +4723,26 @@
 </ct:contentTypeSchema>
 </file>
 
-<file path=customXml/item2.xml><?xml version="1.0" encoding="utf-8"?>
-<?mso-contentType ?>
-<FormTemplates xmlns="http://schemas.microsoft.com/sharepoint/v3/contenttype/forms">
-  <Display>DocumentLibraryForm</Display>
-  <Edit>DocumentLibraryForm</Edit>
-  <New>DocumentLibraryForm</New>
-</FormTemplates>
+<file path=customXml/itemProps1.xml><?xml version="1.0" encoding="utf-8"?>
+<ds:datastoreItem xmlns:ds="http://schemas.openxmlformats.org/officeDocument/2006/customXml" ds:itemID="{DEC3F211-A3ED-4D74-812F-955FD328EBB9}">
+  <ds:schemaRefs>
+    <ds:schemaRef ds:uri="http://schemas.microsoft.com/office/2006/metadata/properties"/>
+    <ds:schemaRef ds:uri="http://schemas.microsoft.com/office/infopath/2007/PartnerControls"/>
+    <ds:schemaRef ds:uri="8ca2a57e-8138-4b57-956a-eb6e2c7049cc"/>
+    <ds:schemaRef ds:uri="1d2798d9-1030-4cc5-be7b-200f9e628651"/>
+  </ds:schemaRefs>
+</ds:datastoreItem>
 </file>
 
-<file path=customXml/item3.xml><?xml version="1.0" encoding="utf-8"?>
-<p:properties xmlns:p="http://schemas.microsoft.com/office/2006/metadata/properties" xmlns:xsi="http://www.w3.org/2001/XMLSchema-instance" xmlns:pc="http://schemas.microsoft.com/office/infopath/2007/PartnerControls">
-  <documentManagement>
-    <lcf76f155ced4ddcb4097134ff3c332f xmlns="8ca2a57e-8138-4b57-956a-eb6e2c7049cc">
-      <Terms xmlns="http://schemas.microsoft.com/office/infopath/2007/PartnerControls"/>
-    </lcf76f155ced4ddcb4097134ff3c332f>
-    <TaxCatchAll xmlns="1d2798d9-1030-4cc5-be7b-200f9e628651" xsi:nil="true"/>
-  </documentManagement>
-</p:properties>
+<file path=customXml/itemProps2.xml><?xml version="1.0" encoding="utf-8"?>
+<ds:datastoreItem xmlns:ds="http://schemas.openxmlformats.org/officeDocument/2006/customXml" ds:itemID="{6C7D064E-B9B1-4DD1-96C1-B59BEDBDE508}">
+  <ds:schemaRefs>
+    <ds:schemaRef ds:uri="http://schemas.microsoft.com/sharepoint/v3/contenttype/forms"/>
+  </ds:schemaRefs>
+</ds:datastoreItem>
 </file>
 
-<file path=customXml/itemProps1.xml><?xml version="1.0" encoding="utf-8"?>
+<file path=customXml/itemProps3.xml><?xml version="1.0" encoding="utf-8"?>
 <ds:datastoreItem xmlns:ds="http://schemas.openxmlformats.org/officeDocument/2006/customXml" ds:itemID="{5C49EB71-DCC6-4AD6-B283-AD28F75E5568}">
   <ds:schemaRefs>
     <ds:schemaRef ds:uri="http://schemas.microsoft.com/office/2006/metadata/contentType"/>
@@ -4984,23 +4759,4 @@
     <ds:schemaRef ds:uri="http://schemas.microsoft.com/internal/obd"/>
   </ds:schemaRefs>
 </ds:datastoreItem>
-</file>
-
-<file path=customXml/itemProps2.xml><?xml version="1.0" encoding="utf-8"?>
-<ds:datastoreItem xmlns:ds="http://schemas.openxmlformats.org/officeDocument/2006/customXml" ds:itemID="{6C7D064E-B9B1-4DD1-96C1-B59BEDBDE508}">
-  <ds:schemaRefs>
-    <ds:schemaRef ds:uri="http://schemas.microsoft.com/sharepoint/v3/contenttype/forms"/>
-  </ds:schemaRefs>
-</ds:datastoreItem>
-</file>
-
-<file path=customXml/itemProps3.xml><?xml version="1.0" encoding="utf-8"?>
-<ds:datastoreItem xmlns:ds="http://schemas.openxmlformats.org/officeDocument/2006/customXml" ds:itemID="{DEC3F211-A3ED-4D74-812F-955FD328EBB9}">
-  <ds:schemaRefs>
-    <ds:schemaRef ds:uri="http://schemas.microsoft.com/office/2006/metadata/properties"/>
-    <ds:schemaRef ds:uri="http://schemas.microsoft.com/office/infopath/2007/PartnerControls"/>
-    <ds:schemaRef ds:uri="8ca2a57e-8138-4b57-956a-eb6e2c7049cc"/>
-    <ds:schemaRef ds:uri="1d2798d9-1030-4cc5-be7b-200f9e628651"/>
-  </ds:schemaRefs>
-</ds:datastoreItem>
 </file>
</xml_diff>